<commit_message>
feat(aero): implementation du module aerodynamics.py depuis les donnees de openVSP
</commit_message>
<xml_diff>
--- a/IEEE_Gabarit (Word).docx
+++ b/IEEE_Gabarit (Word).docx
@@ -1,6 +1,6 @@
 
 <file path=word/document.xml><?xml version="1.0" encoding="utf-8"?>
-<w:document xmlns:cx="http://schemas.microsoft.com/office/drawing/2014/chartex" xmlns:cx1="http://schemas.microsoft.com/office/drawing/2015/9/8/chartex" xmlns:mc="http://schemas.openxmlformats.org/markup-compatibility/2006" xmlns:o="urn:schemas-microsoft-com:office:office" xmlns:r="http://purl.oclc.org/ooxml/officeDocument/relationships" xmlns:m="http://purl.oclc.org/ooxml/officeDocument/math" xmlns:v="urn:schemas-microsoft-com:vml" xmlns:wp14="http://schemas.microsoft.com/office/word/2010/wordprocessingDrawing" xmlns:wp="http://purl.oclc.org/ooxml/drawingml/wordprocessingDrawing" xmlns:w10="urn:schemas-microsoft-com:office:word" xmlns:w="http://purl.oclc.org/ooxml/wordprocessingml/main" xmlns:w14="http://schemas.microsoft.com/office/word/2010/wordml" xmlns:w15="http://schemas.microsoft.com/office/word/2012/wordml" xmlns:w16se="http://schemas.microsoft.com/office/word/2015/wordml/symex" xmlns:wpi="http://schemas.microsoft.com/office/word/2010/wordprocessingInk" xmlns:wne="http://schemas.microsoft.com/office/word/2006/wordml" mc:Ignorable="w14 w15 w16se wne wp14" w:conformance="strict">
+<w:document xmlns:cx="http://schemas.microsoft.com/office/drawing/2014/chartex" xmlns:cx1="http://schemas.microsoft.com/office/drawing/2015/9/8/chartex" xmlns:cx2="http://schemas.microsoft.com/office/drawing/2015/10/21/chartex" xmlns:cx3="http://schemas.microsoft.com/office/drawing/2016/5/9/chartex" xmlns:cx4="http://schemas.microsoft.com/office/drawing/2016/5/10/chartex" xmlns:cx5="http://schemas.microsoft.com/office/drawing/2016/5/11/chartex" xmlns:cx6="http://schemas.microsoft.com/office/drawing/2016/5/12/chartex" xmlns:cx7="http://schemas.microsoft.com/office/drawing/2016/5/13/chartex" xmlns:cx8="http://schemas.microsoft.com/office/drawing/2016/5/14/chartex" xmlns:mc="http://schemas.openxmlformats.org/markup-compatibility/2006" xmlns:aink="http://schemas.microsoft.com/office/drawing/2016/ink" xmlns:am3d="http://schemas.microsoft.com/office/drawing/2017/model3d" xmlns:o="urn:schemas-microsoft-com:office:office" xmlns:oel="http://schemas.microsoft.com/office/2019/extlst" xmlns:r="http://purl.oclc.org/ooxml/officeDocument/relationships" xmlns:m="http://purl.oclc.org/ooxml/officeDocument/math" xmlns:v="urn:schemas-microsoft-com:vml" xmlns:wp14="http://schemas.microsoft.com/office/word/2010/wordprocessingDrawing" xmlns:wp="http://purl.oclc.org/ooxml/drawingml/wordprocessingDrawing" xmlns:w10="urn:schemas-microsoft-com:office:word" xmlns:w="http://purl.oclc.org/ooxml/wordprocessingml/main" xmlns:w14="http://schemas.microsoft.com/office/word/2010/wordml" xmlns:w15="http://schemas.microsoft.com/office/word/2012/wordml" xmlns:w16cex="http://schemas.microsoft.com/office/word/2018/wordml/cex" xmlns:w16cid="http://schemas.microsoft.com/office/word/2016/wordml/cid" xmlns:w16="http://schemas.microsoft.com/office/word/2018/wordml" xmlns:w16du="http://schemas.microsoft.com/office/word/2023/wordml/word16du" xmlns:w16sdtdh="http://schemas.microsoft.com/office/word/2020/wordml/sdtdatahash" xmlns:w16sdtfl="http://schemas.microsoft.com/office/word/2024/wordml/sdtformatlock" xmlns:w16se="http://schemas.microsoft.com/office/word/2015/wordml/symex" xmlns:wpi="http://schemas.microsoft.com/office/word/2010/wordprocessingInk" xmlns:wne="http://schemas.microsoft.com/office/word/2006/wordml" mc:Ignorable="w14 w15 w16se w16cid w16 w16cex w16sdtdh w16sdtfl w16du wne wp14" w:conformance="strict">
   <w:body>
     <w:p>
       <w:pPr>
@@ -1104,13 +1104,8 @@
       <w:r>
         <w:t>—</w:t>
       </w:r>
-      <w:proofErr w:type="gramStart"/>
-      <w:r>
-        <w:t>This</w:t>
-      </w:r>
-      <w:proofErr w:type="gramEnd"/>
-      <w:r>
-        <w:t xml:space="preserve"> electronic document is a “live” template and already defines the components of your paper [title, text, heads, etc.] in its style sheet. </w:t>
+      <w:r>
+        <w:t xml:space="preserve">This electronic document is a “live” template and already defines the components of your paper [title, text, heads, etc.] in its style sheet. </w:t>
       </w:r>
       <w:r>
         <w:t xml:space="preserve"> </w:t>
@@ -1468,7 +1463,10 @@
         <w:pStyle w:val="Heading2"/>
       </w:pPr>
       <w:r>
-        <w:t>Maintaining the Integrity of the Specifications</w:t>
+        <w:t>Maintaining the Integrity of the Specificatio</w:t>
+      </w:r>
+      <w:r>
+        <w:t>jhghj</w:t>
       </w:r>
     </w:p>
     <w:p>
@@ -1576,15 +1574,7 @@
       </w:r>
       <w:proofErr w:type="spellEnd"/>
       <w:r>
-        <w:t xml:space="preserve">, dc, and </w:t>
-      </w:r>
-      <w:proofErr w:type="spellStart"/>
-      <w:r>
-        <w:t>rms</w:t>
-      </w:r>
-      <w:proofErr w:type="spellEnd"/>
-      <w:r>
-        <w:t xml:space="preserve"> do not have to be defined. Do not use abbreviations in the title or heads unless they are unavoidable.</w:t>
+        <w:t>, dc, and rms do not have to be defined. Do not use abbreviations in the title or heads unless they are unavoidable.</w:t>
       </w:r>
     </w:p>
     <w:p>
@@ -1634,15 +1624,15 @@
         <w:pStyle w:val="bulletlist"/>
       </w:pPr>
       <w:r>
-        <w:t>Do not mix complete spellings and abbreviations of units: “</w:t>
+        <w:t>Do not mix complete spellings and abbreviations of units: “Wb/m2” or “</w:t>
       </w:r>
       <w:proofErr w:type="spellStart"/>
       <w:r>
-        <w:t>Wb</w:t>
+        <w:t>webers</w:t>
       </w:r>
       <w:proofErr w:type="spellEnd"/>
       <w:r>
-        <w:t>/m2” or “</w:t>
+        <w:t xml:space="preserve"> per square meter”, not “</w:t>
       </w:r>
       <w:proofErr w:type="spellStart"/>
       <w:r>
@@ -1650,22 +1640,14 @@
       </w:r>
       <w:proofErr w:type="spellEnd"/>
       <w:r>
-        <w:t xml:space="preserve"> per square meter”, not “</w:t>
+        <w:t xml:space="preserve">/m2”.  Spell out units when they appear in text: “. . . a few </w:t>
       </w:r>
       <w:proofErr w:type="spellStart"/>
       <w:r>
-        <w:t>webers</w:t>
+        <w:t>henries</w:t>
       </w:r>
       <w:proofErr w:type="spellEnd"/>
       <w:r>
-        <w:t xml:space="preserve">/m2”.  Spell out units when they appear in text: “. . . a few </w:t>
-      </w:r>
-      <w:proofErr w:type="spellStart"/>
-      <w:r>
-        <w:t>henries</w:t>
-      </w:r>
-      <w:proofErr w:type="spellEnd"/>
-      <w:r>
         <w:t>”, not “. . . a few H”.</w:t>
       </w:r>
     </w:p>
@@ -1714,15 +1696,7 @@
         </w:rPr>
       </w:pPr>
       <w:r>
-        <w:t xml:space="preserve">Number equations consecutively. Equation numbers, within parentheses, are to position flush right, as in (1), using a right tab stop. To make your equations more compact, you may use the solidus ( / ), the </w:t>
-      </w:r>
-      <w:proofErr w:type="spellStart"/>
-      <w:r>
-        <w:t>exp</w:t>
-      </w:r>
-      <w:proofErr w:type="spellEnd"/>
-      <w:r>
-        <w:t xml:space="preserve"> function, or appropriate exponents. Italicize Roman symbols for quantities and variables, but not Greek symbols. Use a long dash rather than a hyphen for a minus sign. Punctuate equations with commas or periods when they are part of a sentence, as in</w:t>
+        <w:t>Number equations consecutively. Equation numbers, within parentheses, are to position flush right, as in (1), using a right tab stop. To make your equations more compact, you may use the solidus ( / ), the exp function, or appropriate exponents. Italicize Roman symbols for quantities and variables, but not Greek symbols. Use a long dash rather than a hyphen for a minus sign. Punctuate equations with commas or periods when they are part of a sentence, as in</w:t>
       </w:r>
       <w:r>
         <w:rPr>
@@ -1734,6 +1708,9 @@
     <w:p>
       <w:pPr>
         <w:pStyle w:val="equation"/>
+        <w:rPr>
+          <w:rFonts w:hint="eastAsia"/>
+        </w:rPr>
       </w:pPr>
       <w:r>
         <w:tab/>
@@ -2432,8 +2409,11 @@
         <w:pStyle w:val="tablefootnote"/>
       </w:pPr>
       <w:r>
+        <w:rPr>
+          <w:noProof/>
+        </w:rPr>
         <w:drawing>
-          <wp:anchor distT="0" distB="0" distL="114300" distR="114300" simplePos="0" relativeHeight="251657728" behindDoc="1" locked="0" layoutInCell="1" allowOverlap="1">
+          <wp:anchor distT="0" distB="0" distL="114300" distR="114300" simplePos="0" relativeHeight="251657728" behindDoc="1" locked="0" layoutInCell="1" allowOverlap="1" wp14:anchorId="25E9BA6C" wp14:editId="12A19AB4">
             <wp:simplePos x="0" y="0"/>
             <wp:positionH relativeFrom="column">
               <wp:align>right</wp:align>
@@ -2937,7 +2917,7 @@
 </file>
 
 <file path=word/endnotes.xml><?xml version="1.0" encoding="utf-8"?>
-<w:endnotes xmlns:cx="http://schemas.microsoft.com/office/drawing/2014/chartex" xmlns:cx1="http://schemas.microsoft.com/office/drawing/2015/9/8/chartex" xmlns:mc="http://schemas.openxmlformats.org/markup-compatibility/2006" xmlns:o="urn:schemas-microsoft-com:office:office" xmlns:r="http://purl.oclc.org/ooxml/officeDocument/relationships" xmlns:m="http://purl.oclc.org/ooxml/officeDocument/math" xmlns:v="urn:schemas-microsoft-com:vml" xmlns:wp14="http://schemas.microsoft.com/office/word/2010/wordprocessingDrawing" xmlns:wp="http://purl.oclc.org/ooxml/drawingml/wordprocessingDrawing" xmlns:w10="urn:schemas-microsoft-com:office:word" xmlns:w="http://purl.oclc.org/ooxml/wordprocessingml/main" xmlns:w14="http://schemas.microsoft.com/office/word/2010/wordml" xmlns:w15="http://schemas.microsoft.com/office/word/2012/wordml" xmlns:w16se="http://schemas.microsoft.com/office/word/2015/wordml/symex" xmlns:wpi="http://schemas.microsoft.com/office/word/2010/wordprocessingInk" xmlns:wne="http://schemas.microsoft.com/office/word/2006/wordml" mc:Ignorable="w14 w15 w16se wne wp14">
+<w:endnotes xmlns:cx="http://schemas.microsoft.com/office/drawing/2014/chartex" xmlns:cx1="http://schemas.microsoft.com/office/drawing/2015/9/8/chartex" xmlns:cx2="http://schemas.microsoft.com/office/drawing/2015/10/21/chartex" xmlns:cx3="http://schemas.microsoft.com/office/drawing/2016/5/9/chartex" xmlns:cx4="http://schemas.microsoft.com/office/drawing/2016/5/10/chartex" xmlns:cx5="http://schemas.microsoft.com/office/drawing/2016/5/11/chartex" xmlns:cx6="http://schemas.microsoft.com/office/drawing/2016/5/12/chartex" xmlns:cx7="http://schemas.microsoft.com/office/drawing/2016/5/13/chartex" xmlns:cx8="http://schemas.microsoft.com/office/drawing/2016/5/14/chartex" xmlns:mc="http://schemas.openxmlformats.org/markup-compatibility/2006" xmlns:aink="http://schemas.microsoft.com/office/drawing/2016/ink" xmlns:am3d="http://schemas.microsoft.com/office/drawing/2017/model3d" xmlns:o="urn:schemas-microsoft-com:office:office" xmlns:oel="http://schemas.microsoft.com/office/2019/extlst" xmlns:r="http://purl.oclc.org/ooxml/officeDocument/relationships" xmlns:m="http://purl.oclc.org/ooxml/officeDocument/math" xmlns:v="urn:schemas-microsoft-com:vml" xmlns:wp14="http://schemas.microsoft.com/office/word/2010/wordprocessingDrawing" xmlns:wp="http://purl.oclc.org/ooxml/drawingml/wordprocessingDrawing" xmlns:w10="urn:schemas-microsoft-com:office:word" xmlns:w="http://purl.oclc.org/ooxml/wordprocessingml/main" xmlns:w14="http://schemas.microsoft.com/office/word/2010/wordml" xmlns:w15="http://schemas.microsoft.com/office/word/2012/wordml" xmlns:w16cex="http://schemas.microsoft.com/office/word/2018/wordml/cex" xmlns:w16cid="http://schemas.microsoft.com/office/word/2016/wordml/cid" xmlns:w16="http://schemas.microsoft.com/office/word/2018/wordml" xmlns:w16du="http://schemas.microsoft.com/office/word/2023/wordml/word16du" xmlns:w16sdtdh="http://schemas.microsoft.com/office/word/2020/wordml/sdtdatahash" xmlns:w16sdtfl="http://schemas.microsoft.com/office/word/2024/wordml/sdtformatlock" xmlns:w16se="http://schemas.microsoft.com/office/word/2015/wordml/symex" xmlns:wpi="http://schemas.microsoft.com/office/word/2010/wordprocessingInk" xmlns:wne="http://schemas.microsoft.com/office/word/2006/wordml" mc:Ignorable="w14 w15 w16se w16cid w16 w16cex w16sdtdh w16sdtfl w16du wne wp14">
   <w:endnote w:type="separator" w:id="-1">
     <w:p>
       <w:r>
@@ -2956,7 +2936,7 @@
 </file>
 
 <file path=word/footer1.xml><?xml version="1.0" encoding="utf-8"?>
-<w:ftr xmlns:cx="http://schemas.microsoft.com/office/drawing/2014/chartex" xmlns:cx1="http://schemas.microsoft.com/office/drawing/2015/9/8/chartex" xmlns:mc="http://schemas.openxmlformats.org/markup-compatibility/2006" xmlns:o="urn:schemas-microsoft-com:office:office" xmlns:r="http://purl.oclc.org/ooxml/officeDocument/relationships" xmlns:m="http://purl.oclc.org/ooxml/officeDocument/math" xmlns:v="urn:schemas-microsoft-com:vml" xmlns:wp14="http://schemas.microsoft.com/office/word/2010/wordprocessingDrawing" xmlns:wp="http://purl.oclc.org/ooxml/drawingml/wordprocessingDrawing" xmlns:w10="urn:schemas-microsoft-com:office:word" xmlns:w="http://purl.oclc.org/ooxml/wordprocessingml/main" xmlns:w14="http://schemas.microsoft.com/office/word/2010/wordml" xmlns:w15="http://schemas.microsoft.com/office/word/2012/wordml" xmlns:w16se="http://schemas.microsoft.com/office/word/2015/wordml/symex" xmlns:wpi="http://schemas.microsoft.com/office/word/2010/wordprocessingInk" xmlns:wne="http://schemas.microsoft.com/office/word/2006/wordml" mc:Ignorable="w14 w15 w16se wne wp14">
+<w:ftr xmlns:cx="http://schemas.microsoft.com/office/drawing/2014/chartex" xmlns:cx1="http://schemas.microsoft.com/office/drawing/2015/9/8/chartex" xmlns:cx2="http://schemas.microsoft.com/office/drawing/2015/10/21/chartex" xmlns:cx3="http://schemas.microsoft.com/office/drawing/2016/5/9/chartex" xmlns:cx4="http://schemas.microsoft.com/office/drawing/2016/5/10/chartex" xmlns:cx5="http://schemas.microsoft.com/office/drawing/2016/5/11/chartex" xmlns:cx6="http://schemas.microsoft.com/office/drawing/2016/5/12/chartex" xmlns:cx7="http://schemas.microsoft.com/office/drawing/2016/5/13/chartex" xmlns:cx8="http://schemas.microsoft.com/office/drawing/2016/5/14/chartex" xmlns:mc="http://schemas.openxmlformats.org/markup-compatibility/2006" xmlns:aink="http://schemas.microsoft.com/office/drawing/2016/ink" xmlns:am3d="http://schemas.microsoft.com/office/drawing/2017/model3d" xmlns:o="urn:schemas-microsoft-com:office:office" xmlns:oel="http://schemas.microsoft.com/office/2019/extlst" xmlns:r="http://purl.oclc.org/ooxml/officeDocument/relationships" xmlns:m="http://purl.oclc.org/ooxml/officeDocument/math" xmlns:v="urn:schemas-microsoft-com:vml" xmlns:wp14="http://schemas.microsoft.com/office/word/2010/wordprocessingDrawing" xmlns:wp="http://purl.oclc.org/ooxml/drawingml/wordprocessingDrawing" xmlns:w10="urn:schemas-microsoft-com:office:word" xmlns:w="http://purl.oclc.org/ooxml/wordprocessingml/main" xmlns:w14="http://schemas.microsoft.com/office/word/2010/wordml" xmlns:w15="http://schemas.microsoft.com/office/word/2012/wordml" xmlns:w16cex="http://schemas.microsoft.com/office/word/2018/wordml/cex" xmlns:w16cid="http://schemas.microsoft.com/office/word/2016/wordml/cid" xmlns:w16="http://schemas.microsoft.com/office/word/2018/wordml" xmlns:w16du="http://schemas.microsoft.com/office/word/2023/wordml/word16du" xmlns:w16sdtdh="http://schemas.microsoft.com/office/word/2020/wordml/sdtdatahash" xmlns:w16sdtfl="http://schemas.microsoft.com/office/word/2024/wordml/sdtformatlock" xmlns:w16se="http://schemas.microsoft.com/office/word/2015/wordml/symex" xmlns:wpi="http://schemas.microsoft.com/office/word/2010/wordprocessingInk" xmlns:wne="http://schemas.microsoft.com/office/word/2006/wordml" mc:Ignorable="w14 w15 w16se w16cid w16 w16cex w16sdtdh w16sdtfl w16du wne wp14">
   <w:p>
     <w:pPr>
       <w:pStyle w:val="Footer"/>
@@ -2978,7 +2958,7 @@
 </file>
 
 <file path=word/footnotes.xml><?xml version="1.0" encoding="utf-8"?>
-<w:footnotes xmlns:cx="http://schemas.microsoft.com/office/drawing/2014/chartex" xmlns:cx1="http://schemas.microsoft.com/office/drawing/2015/9/8/chartex" xmlns:mc="http://schemas.openxmlformats.org/markup-compatibility/2006" xmlns:o="urn:schemas-microsoft-com:office:office" xmlns:r="http://purl.oclc.org/ooxml/officeDocument/relationships" xmlns:m="http://purl.oclc.org/ooxml/officeDocument/math" xmlns:v="urn:schemas-microsoft-com:vml" xmlns:wp14="http://schemas.microsoft.com/office/word/2010/wordprocessingDrawing" xmlns:wp="http://purl.oclc.org/ooxml/drawingml/wordprocessingDrawing" xmlns:w10="urn:schemas-microsoft-com:office:word" xmlns:w="http://purl.oclc.org/ooxml/wordprocessingml/main" xmlns:w14="http://schemas.microsoft.com/office/word/2010/wordml" xmlns:w15="http://schemas.microsoft.com/office/word/2012/wordml" xmlns:w16se="http://schemas.microsoft.com/office/word/2015/wordml/symex" xmlns:wpi="http://schemas.microsoft.com/office/word/2010/wordprocessingInk" xmlns:wne="http://schemas.microsoft.com/office/word/2006/wordml" mc:Ignorable="w14 w15 w16se wne wp14">
+<w:footnotes xmlns:cx="http://schemas.microsoft.com/office/drawing/2014/chartex" xmlns:cx1="http://schemas.microsoft.com/office/drawing/2015/9/8/chartex" xmlns:cx2="http://schemas.microsoft.com/office/drawing/2015/10/21/chartex" xmlns:cx3="http://schemas.microsoft.com/office/drawing/2016/5/9/chartex" xmlns:cx4="http://schemas.microsoft.com/office/drawing/2016/5/10/chartex" xmlns:cx5="http://schemas.microsoft.com/office/drawing/2016/5/11/chartex" xmlns:cx6="http://schemas.microsoft.com/office/drawing/2016/5/12/chartex" xmlns:cx7="http://schemas.microsoft.com/office/drawing/2016/5/13/chartex" xmlns:cx8="http://schemas.microsoft.com/office/drawing/2016/5/14/chartex" xmlns:mc="http://schemas.openxmlformats.org/markup-compatibility/2006" xmlns:aink="http://schemas.microsoft.com/office/drawing/2016/ink" xmlns:am3d="http://schemas.microsoft.com/office/drawing/2017/model3d" xmlns:o="urn:schemas-microsoft-com:office:office" xmlns:oel="http://schemas.microsoft.com/office/2019/extlst" xmlns:r="http://purl.oclc.org/ooxml/officeDocument/relationships" xmlns:m="http://purl.oclc.org/ooxml/officeDocument/math" xmlns:v="urn:schemas-microsoft-com:vml" xmlns:wp14="http://schemas.microsoft.com/office/word/2010/wordprocessingDrawing" xmlns:wp="http://purl.oclc.org/ooxml/drawingml/wordprocessingDrawing" xmlns:w10="urn:schemas-microsoft-com:office:word" xmlns:w="http://purl.oclc.org/ooxml/wordprocessingml/main" xmlns:w14="http://schemas.microsoft.com/office/word/2010/wordml" xmlns:w15="http://schemas.microsoft.com/office/word/2012/wordml" xmlns:w16cex="http://schemas.microsoft.com/office/word/2018/wordml/cex" xmlns:w16cid="http://schemas.microsoft.com/office/word/2016/wordml/cid" xmlns:w16="http://schemas.microsoft.com/office/word/2018/wordml" xmlns:w16du="http://schemas.microsoft.com/office/word/2023/wordml/word16du" xmlns:w16sdtdh="http://schemas.microsoft.com/office/word/2020/wordml/sdtdatahash" xmlns:w16sdtfl="http://schemas.microsoft.com/office/word/2024/wordml/sdtformatlock" xmlns:w16se="http://schemas.microsoft.com/office/word/2015/wordml/symex" xmlns:wpi="http://schemas.microsoft.com/office/word/2010/wordprocessingInk" xmlns:wne="http://schemas.microsoft.com/office/word/2006/wordml" mc:Ignorable="w14 w15 w16se w16cid w16 w16cex w16sdtdh w16sdtfl w16du wne wp14">
   <w:footnote w:type="separator" w:id="-1">
     <w:p>
       <w:r>
@@ -2997,7 +2977,7 @@
 </file>
 
 <file path=word/numbering.xml><?xml version="1.0" encoding="utf-8"?>
-<w:numbering xmlns:cx="http://schemas.microsoft.com/office/drawing/2014/chartex" xmlns:cx1="http://schemas.microsoft.com/office/drawing/2015/9/8/chartex" xmlns:mc="http://schemas.openxmlformats.org/markup-compatibility/2006" xmlns:o="urn:schemas-microsoft-com:office:office" xmlns:r="http://purl.oclc.org/ooxml/officeDocument/relationships" xmlns:m="http://purl.oclc.org/ooxml/officeDocument/math" xmlns:v="urn:schemas-microsoft-com:vml" xmlns:wp14="http://schemas.microsoft.com/office/word/2010/wordprocessingDrawing" xmlns:wp="http://purl.oclc.org/ooxml/drawingml/wordprocessingDrawing" xmlns:w10="urn:schemas-microsoft-com:office:word" xmlns:w="http://purl.oclc.org/ooxml/wordprocessingml/main" xmlns:w14="http://schemas.microsoft.com/office/word/2010/wordml" xmlns:w15="http://schemas.microsoft.com/office/word/2012/wordml" xmlns:w16se="http://schemas.microsoft.com/office/word/2015/wordml/symex" xmlns:wpi="http://schemas.microsoft.com/office/word/2010/wordprocessingInk" xmlns:wne="http://schemas.microsoft.com/office/word/2006/wordml" mc:Ignorable="w14 w15 w16se wne wp14">
+<w:numbering xmlns:cx="http://schemas.microsoft.com/office/drawing/2014/chartex" xmlns:cx1="http://schemas.microsoft.com/office/drawing/2015/9/8/chartex" xmlns:cx2="http://schemas.microsoft.com/office/drawing/2015/10/21/chartex" xmlns:cx3="http://schemas.microsoft.com/office/drawing/2016/5/9/chartex" xmlns:cx4="http://schemas.microsoft.com/office/drawing/2016/5/10/chartex" xmlns:cx5="http://schemas.microsoft.com/office/drawing/2016/5/11/chartex" xmlns:cx6="http://schemas.microsoft.com/office/drawing/2016/5/12/chartex" xmlns:cx7="http://schemas.microsoft.com/office/drawing/2016/5/13/chartex" xmlns:cx8="http://schemas.microsoft.com/office/drawing/2016/5/14/chartex" xmlns:mc="http://schemas.openxmlformats.org/markup-compatibility/2006" xmlns:aink="http://schemas.microsoft.com/office/drawing/2016/ink" xmlns:am3d="http://schemas.microsoft.com/office/drawing/2017/model3d" xmlns:o="urn:schemas-microsoft-com:office:office" xmlns:oel="http://schemas.microsoft.com/office/2019/extlst" xmlns:r="http://purl.oclc.org/ooxml/officeDocument/relationships" xmlns:m="http://purl.oclc.org/ooxml/officeDocument/math" xmlns:v="urn:schemas-microsoft-com:vml" xmlns:wp14="http://schemas.microsoft.com/office/word/2010/wordprocessingDrawing" xmlns:wp="http://purl.oclc.org/ooxml/drawingml/wordprocessingDrawing" xmlns:w10="urn:schemas-microsoft-com:office:word" xmlns:w="http://purl.oclc.org/ooxml/wordprocessingml/main" xmlns:w14="http://schemas.microsoft.com/office/word/2010/wordml" xmlns:w15="http://schemas.microsoft.com/office/word/2012/wordml" xmlns:w16cex="http://schemas.microsoft.com/office/word/2018/wordml/cex" xmlns:w16cid="http://schemas.microsoft.com/office/word/2016/wordml/cid" xmlns:w16="http://schemas.microsoft.com/office/word/2018/wordml" xmlns:w16du="http://schemas.microsoft.com/office/word/2023/wordml/word16du" xmlns:w16sdtdh="http://schemas.microsoft.com/office/word/2020/wordml/sdtdatahash" xmlns:w16sdtfl="http://schemas.microsoft.com/office/word/2024/wordml/sdtformatlock" xmlns:w16se="http://schemas.microsoft.com/office/word/2015/wordml/symex" xmlns:wpi="http://schemas.microsoft.com/office/word/2010/wordprocessingInk" xmlns:wne="http://schemas.microsoft.com/office/word/2006/wordml" mc:Ignorable="w14 w15 w16se w16cid w16 w16cex w16sdtdh w16sdtfl w16du wne wp14">
   <w:abstractNum w:abstractNumId="0" w15:restartNumberingAfterBreak="0">
     <w:nsid w:val="FFFFFF1D"/>
     <w:multiLevelType w:val="multilevel"/>
@@ -4389,83 +4369,83 @@
       </w:rPr>
     </w:lvl>
   </w:abstractNum>
-  <w:num w:numId="1">
+  <w:num w:numId="1" w16cid:durableId="1153982994">
     <w:abstractNumId w:val="14"/>
   </w:num>
-  <w:num w:numId="2">
+  <w:num w:numId="2" w16cid:durableId="1717048254">
     <w:abstractNumId w:val="19"/>
   </w:num>
-  <w:num w:numId="3">
+  <w:num w:numId="3" w16cid:durableId="97524414">
     <w:abstractNumId w:val="13"/>
   </w:num>
-  <w:num w:numId="4">
+  <w:num w:numId="4" w16cid:durableId="1001196537">
     <w:abstractNumId w:val="16"/>
   </w:num>
-  <w:num w:numId="5">
+  <w:num w:numId="5" w16cid:durableId="1162357626">
     <w:abstractNumId w:val="16"/>
   </w:num>
-  <w:num w:numId="6">
+  <w:num w:numId="6" w16cid:durableId="1242914400">
     <w:abstractNumId w:val="16"/>
   </w:num>
-  <w:num w:numId="7">
+  <w:num w:numId="7" w16cid:durableId="112985206">
     <w:abstractNumId w:val="16"/>
   </w:num>
-  <w:num w:numId="8">
+  <w:num w:numId="8" w16cid:durableId="1062486065">
     <w:abstractNumId w:val="18"/>
   </w:num>
-  <w:num w:numId="9">
+  <w:num w:numId="9" w16cid:durableId="1791196685">
     <w:abstractNumId w:val="20"/>
   </w:num>
-  <w:num w:numId="10">
+  <w:num w:numId="10" w16cid:durableId="2075422781">
     <w:abstractNumId w:val="15"/>
   </w:num>
-  <w:num w:numId="11">
+  <w:num w:numId="11" w16cid:durableId="247546751">
     <w:abstractNumId w:val="12"/>
   </w:num>
-  <w:num w:numId="12">
+  <w:num w:numId="12" w16cid:durableId="755368818">
     <w:abstractNumId w:val="11"/>
   </w:num>
-  <w:num w:numId="13">
+  <w:num w:numId="13" w16cid:durableId="1783649786">
     <w:abstractNumId w:val="0"/>
   </w:num>
-  <w:num w:numId="14">
+  <w:num w:numId="14" w16cid:durableId="1917088537">
     <w:abstractNumId w:val="10"/>
   </w:num>
-  <w:num w:numId="15">
+  <w:num w:numId="15" w16cid:durableId="1948344371">
     <w:abstractNumId w:val="8"/>
   </w:num>
-  <w:num w:numId="16">
+  <w:num w:numId="16" w16cid:durableId="597980324">
     <w:abstractNumId w:val="7"/>
   </w:num>
-  <w:num w:numId="17">
+  <w:num w:numId="17" w16cid:durableId="874469909">
     <w:abstractNumId w:val="6"/>
   </w:num>
-  <w:num w:numId="18">
+  <w:num w:numId="18" w16cid:durableId="1366977637">
     <w:abstractNumId w:val="5"/>
   </w:num>
-  <w:num w:numId="19">
+  <w:num w:numId="19" w16cid:durableId="849948749">
     <w:abstractNumId w:val="9"/>
   </w:num>
-  <w:num w:numId="20">
+  <w:num w:numId="20" w16cid:durableId="18170140">
     <w:abstractNumId w:val="4"/>
   </w:num>
-  <w:num w:numId="21">
+  <w:num w:numId="21" w16cid:durableId="396785823">
     <w:abstractNumId w:val="3"/>
   </w:num>
-  <w:num w:numId="22">
+  <w:num w:numId="22" w16cid:durableId="1571698846">
     <w:abstractNumId w:val="2"/>
   </w:num>
-  <w:num w:numId="23">
+  <w:num w:numId="23" w16cid:durableId="1522620744">
     <w:abstractNumId w:val="1"/>
   </w:num>
-  <w:num w:numId="24">
+  <w:num w:numId="24" w16cid:durableId="1657955392">
     <w:abstractNumId w:val="17"/>
   </w:num>
 </w:numbering>
 </file>
 
 <file path=word/styles.xml><?xml version="1.0" encoding="utf-8"?>
-<w:styles xmlns:mc="http://schemas.openxmlformats.org/markup-compatibility/2006" xmlns:r="http://purl.oclc.org/ooxml/officeDocument/relationships" xmlns:w="http://purl.oclc.org/ooxml/wordprocessingml/main" xmlns:w14="http://schemas.microsoft.com/office/word/2010/wordml" xmlns:w15="http://schemas.microsoft.com/office/word/2012/wordml" xmlns:w16se="http://schemas.microsoft.com/office/word/2015/wordml/symex" mc:Ignorable="w14 w15 w16se">
+<w:styles xmlns:mc="http://schemas.openxmlformats.org/markup-compatibility/2006" xmlns:r="http://purl.oclc.org/ooxml/officeDocument/relationships" xmlns:w="http://purl.oclc.org/ooxml/wordprocessingml/main" xmlns:w14="http://schemas.microsoft.com/office/word/2010/wordml" xmlns:w15="http://schemas.microsoft.com/office/word/2012/wordml" xmlns:w16cex="http://schemas.microsoft.com/office/word/2018/wordml/cex" xmlns:w16cid="http://schemas.microsoft.com/office/word/2016/wordml/cid" xmlns:w16="http://schemas.microsoft.com/office/word/2018/wordml" xmlns:w16du="http://schemas.microsoft.com/office/word/2023/wordml/word16du" xmlns:w16sdtdh="http://schemas.microsoft.com/office/word/2020/wordml/sdtdatahash" xmlns:w16sdtfl="http://schemas.microsoft.com/office/word/2024/wordml/sdtformatlock" xmlns:w16se="http://schemas.microsoft.com/office/word/2015/wordml/symex" mc:Ignorable="w14 w15 w16se w16cid w16 w16cex w16sdtdh w16sdtfl w16du">
   <w:docDefaults>
     <w:rPrDefault>
       <w:rPr>
@@ -4475,7 +4455,7 @@
     </w:rPrDefault>
     <w:pPrDefault/>
   </w:docDefaults>
-  <w:latentStyles w:defLockedState="0" w:defUIPriority="0" w:defSemiHidden="0" w:defUnhideWhenUsed="0" w:defQFormat="0" w:count="371">
+  <w:latentStyles w:defLockedState="0" w:defUIPriority="0" w:defSemiHidden="0" w:defUnhideWhenUsed="0" w:defQFormat="0" w:count="376">
     <w:lsdException w:name="Normal" w:qFormat="1"/>
     <w:lsdException w:name="heading 1" w:qFormat="1"/>
     <w:lsdException w:name="heading 2" w:qFormat="1"/>
@@ -4750,6 +4730,11 @@
     <w:lsdException w:name="List Table 5 Dark Accent 6" w:uiPriority="50"/>
     <w:lsdException w:name="List Table 6 Colorful Accent 6" w:uiPriority="51"/>
     <w:lsdException w:name="List Table 7 Colorful Accent 6" w:uiPriority="52"/>
+    <w:lsdException w:name="Mention" w:semiHidden="1" w:uiPriority="99" w:unhideWhenUsed="1"/>
+    <w:lsdException w:name="Smart Hyperlink" w:semiHidden="1" w:uiPriority="99" w:unhideWhenUsed="1"/>
+    <w:lsdException w:name="Hashtag" w:semiHidden="1" w:uiPriority="99" w:unhideWhenUsed="1"/>
+    <w:lsdException w:name="Unresolved Mention" w:semiHidden="1" w:uiPriority="99" w:unhideWhenUsed="1"/>
+    <w:lsdException w:name="Smart Link" w:semiHidden="1" w:uiPriority="99" w:unhideWhenUsed="1"/>
   </w:latentStyles>
   <w:style w:type="paragraph" w:default="1" w:styleId="Normal">
     <w:name w:val="Normal"/>

</xml_diff>